<commit_message>
docs: sync project guides with current source
</commit_message>
<xml_diff>
--- a/Doc/参数和引脚说明.docx
+++ b/Doc/参数和引脚说明.docx
@@ -25,7 +25,7 @@
           <w:sz w:val="24"/>
           <w:szCs w:val="24"/>
         </w:rPr>
-        <w:t>Algorithm/line_track.h</w:t>
+        <w:t>循迹参数：Algorithm/line_track.h</w:t>
       </w:r>
     </w:p>
     <w:tbl>
@@ -1401,14 +1401,13 @@
         <w:rPr>
           <w:rFonts w:hint="eastAsia"/>
         </w:rPr>
-        <w:t>DRV_ENCODER_WHEEL_DIAMETER_MM</w:t>
+        <w:t>DRV_ENCODER_WHEEL_DIAMETER_MM 在 Driver/drv_encoder.h</w:t>
       </w:r>
       <w:r>
         <w:rPr>
           <w:rFonts w:hint="eastAsia"/>
           <w:lang w:val="en-US" w:eastAsia="zh-CN"/>
         </w:rPr>
-        <w:t>在driver/drv_encoder.h</w:t>
       </w:r>
     </w:p>
     <w:p>
@@ -1423,7 +1422,7 @@
           <w:rFonts w:hint="eastAsia"/>
           <w:lang w:val="en-US" w:eastAsia="zh-CN"/>
         </w:rPr>
-        <w:t>ANGLE_CONTROL_WHEEL_BASE_MM在app/angle_control.h</w:t>
+        <w:t>HEADING_ENCODER_WHEEL_BASE_MM 在 Algorithm/heading_estimator.h（仅 HEADING_SOURCE_ENCODER 模式使用；当前默认 HEADING_SOURCE_FUSED）</w:t>
       </w:r>
     </w:p>
     <w:tbl>
@@ -1932,7 +1931,7 @@
                 <w:szCs w:val="24"/>
                 <w:lang w:val="en-US" w:eastAsia="zh-CN" w:bidi="ar"/>
               </w:rPr>
-              <w:t>左/右转不够，例如目标 90，实际 75</w:t>
+              <w:t>编码器航向模式下转角偏小</w:t>
             </w:r>
           </w:p>
         </w:tc>
@@ -1959,7 +1958,7 @@
                 <w:szCs w:val="24"/>
                 <w:lang w:val="en-US" w:eastAsia="zh-CN" w:bidi="ar"/>
               </w:rPr>
-              <w:t>ANGLE_CONTROL_WHEEL_BASE_MM</w:t>
+              <w:t>HEADING_ENCODER_WHEEL_BASE_MM</w:t>
             </w:r>
           </w:p>
         </w:tc>
@@ -2065,7 +2064,7 @@
                 <w:szCs w:val="24"/>
                 <w:lang w:val="en-US" w:eastAsia="zh-CN" w:bidi="ar"/>
               </w:rPr>
-              <w:t>左/右转过头，例如目标 90，实际 110</w:t>
+              <w:t>编码器航向模式下转角偏大</w:t>
             </w:r>
           </w:p>
         </w:tc>
@@ -2092,7 +2091,7 @@
                 <w:szCs w:val="24"/>
                 <w:lang w:val="en-US" w:eastAsia="zh-CN" w:bidi="ar"/>
               </w:rPr>
-              <w:t>ANGLE_CONTROL_WHEEL_BASE_MM</w:t>
+              <w:t>HEADING_ENCODER_WHEEL_BASE_MM</w:t>
             </w:r>
           </w:p>
         </w:tc>
@@ -2285,7 +2284,7 @@
           <w:szCs w:val="24"/>
           <w:lang w:val="en-US" w:eastAsia="zh-CN"/>
         </w:rPr>
-        <w:t>App/</w:t>
+        <w:t>APP/motion_action.h 参数</w:t>
       </w:r>
       <w:r>
         <w:rPr>
@@ -2293,7 +2292,6 @@
           <w:sz w:val="24"/>
           <w:szCs w:val="24"/>
         </w:rPr>
-        <w:t>motion_action</w:t>
       </w:r>
       <w:r>
         <w:rPr>
@@ -2302,7 +2300,6 @@
           <w:szCs w:val="24"/>
           <w:lang w:val="en-US" w:eastAsia="zh-CN"/>
         </w:rPr>
-        <w:t>参数</w:t>
       </w:r>
     </w:p>
     <w:tbl>
@@ -3370,7 +3367,7 @@
         <w:suppressLineNumbers w:val="0"/>
       </w:pPr>
       <w:r>
-        <w:t>一、当前已经启用/实际使用的引脚</w:t>
+        <w:t>一、当前代码中的主要引脚（含驱动模式条件）</w:t>
       </w:r>
     </w:p>
     <w:tbl>
@@ -3767,7 +3764,7 @@
                 <w:szCs w:val="24"/>
                 <w:lang w:val="en-US" w:eastAsia="zh-CN" w:bidi="ar"/>
               </w:rPr>
-              <w:t>UART_PORT1_TX</w:t>
+              <w:t>BSP/bsp_uart.h</w:t>
             </w:r>
           </w:p>
         </w:tc>
@@ -3945,7 +3942,7 @@
                 <w:szCs w:val="24"/>
                 <w:lang w:val="en-US" w:eastAsia="zh-CN" w:bidi="ar"/>
               </w:rPr>
-              <w:t>UART_PORT1_RX</w:t>
+              <w:t>BSP/bsp_uart.h</w:t>
             </w:r>
           </w:p>
         </w:tc>
@@ -4140,7 +4137,7 @@
                 <w:szCs w:val="24"/>
                 <w:lang w:val="en-US" w:eastAsia="zh-CN" w:bidi="ar"/>
               </w:rPr>
-              <w:t>UART_PORT2_TX</w:t>
+              <w:t>BSP/bsp_uart.h</w:t>
             </w:r>
           </w:p>
         </w:tc>
@@ -4318,7 +4315,7 @@
                 <w:szCs w:val="24"/>
                 <w:lang w:val="en-US" w:eastAsia="zh-CN" w:bidi="ar"/>
               </w:rPr>
-              <w:t>UART_PORT2_RX</w:t>
+              <w:t>BSP/bsp_uart.h</w:t>
             </w:r>
           </w:p>
         </w:tc>
@@ -4903,7 +4900,7 @@
                 <w:szCs w:val="24"/>
                 <w:lang w:val="en-US" w:eastAsia="zh-CN" w:bidi="ar"/>
               </w:rPr>
-              <w:t xml:space="preserve">对应 </w:t>
+              <w:t>仅 4WD 启用；默认 2WD 关闭</w:t>
             </w:r>
             <w:r>
               <w:rPr>
@@ -4914,7 +4911,6 @@
                 <w:szCs w:val="24"/>
                 <w:lang w:val="en-US" w:eastAsia="zh-CN" w:bidi="ar"/>
               </w:rPr>
-              <w:t>MOTOR_RL</w:t>
             </w:r>
           </w:p>
         </w:tc>
@@ -5092,7 +5088,7 @@
                 <w:szCs w:val="24"/>
                 <w:lang w:val="en-US" w:eastAsia="zh-CN" w:bidi="ar"/>
               </w:rPr>
-              <w:t xml:space="preserve">对应 </w:t>
+              <w:t>仅 4WD 启用；默认 2WD 关闭</w:t>
             </w:r>
             <w:r>
               <w:rPr>
@@ -5103,7 +5099,6 @@
                 <w:szCs w:val="24"/>
                 <w:lang w:val="en-US" w:eastAsia="zh-CN" w:bidi="ar"/>
               </w:rPr>
-              <w:t>MOTOR_RR</w:t>
             </w:r>
           </w:p>
         </w:tc>
@@ -5997,7 +5992,7 @@
                 <w:szCs w:val="24"/>
                 <w:lang w:val="en-US" w:eastAsia="zh-CN" w:bidi="ar"/>
               </w:rPr>
-              <w:t>左后电机方向脚 1</w:t>
+              <w:t>仅 4WD 启用；默认 2WD 关闭</w:t>
             </w:r>
           </w:p>
         </w:tc>
@@ -6176,7 +6171,7 @@
                 <w:szCs w:val="24"/>
                 <w:lang w:val="en-US" w:eastAsia="zh-CN" w:bidi="ar"/>
               </w:rPr>
-              <w:t>左后电机方向脚 2</w:t>
+              <w:t>仅 4WD 启用；默认 2WD 关闭</w:t>
             </w:r>
           </w:p>
         </w:tc>
@@ -6355,7 +6350,7 @@
                 <w:szCs w:val="24"/>
                 <w:lang w:val="en-US" w:eastAsia="zh-CN" w:bidi="ar"/>
               </w:rPr>
-              <w:t>右后电机方向脚 1</w:t>
+              <w:t>仅 4WD 启用；默认 2WD 关闭</w:t>
             </w:r>
           </w:p>
         </w:tc>
@@ -6533,7 +6528,7 @@
                 <w:szCs w:val="24"/>
                 <w:lang w:val="en-US" w:eastAsia="zh-CN" w:bidi="ar"/>
               </w:rPr>
-              <w:t>右后电机方向脚 2</w:t>
+              <w:t>仅 4WD 启用；默认 2WD 关闭</w:t>
             </w:r>
           </w:p>
         </w:tc>
@@ -6686,7 +6681,7 @@
                 <w:szCs w:val="24"/>
                 <w:lang w:val="en-US" w:eastAsia="zh-CN" w:bidi="ar"/>
               </w:rPr>
-              <w:t>BSP_ENCODER_CH1_A</w:t>
+              <w:t>BSP/bsp_encoder.h</w:t>
             </w:r>
           </w:p>
         </w:tc>
@@ -6865,7 +6860,7 @@
                 <w:szCs w:val="24"/>
                 <w:lang w:val="en-US" w:eastAsia="zh-CN" w:bidi="ar"/>
               </w:rPr>
-              <w:t>BSP_ENCODER_CH1_B</w:t>
+              <w:t>BSP/bsp_encoder.h</w:t>
             </w:r>
           </w:p>
         </w:tc>
@@ -7044,7 +7039,7 @@
                 <w:szCs w:val="24"/>
                 <w:lang w:val="en-US" w:eastAsia="zh-CN" w:bidi="ar"/>
               </w:rPr>
-              <w:t>BSP_ENCODER_CH2_A</w:t>
+              <w:t>BSP/bsp_encoder.h</w:t>
             </w:r>
           </w:p>
         </w:tc>
@@ -7223,7 +7218,7 @@
                 <w:szCs w:val="24"/>
                 <w:lang w:val="en-US" w:eastAsia="zh-CN" w:bidi="ar"/>
               </w:rPr>
-              <w:t>BSP_ENCODER_CH2_B</w:t>
+              <w:t>BSP/bsp_encoder.h</w:t>
             </w:r>
           </w:p>
         </w:tc>
@@ -7402,33 +7397,33 @@
                 <w:szCs w:val="24"/>
                 <w:lang w:val="en-US" w:eastAsia="zh-CN" w:bidi="ar"/>
               </w:rPr>
-              <w:t>BSP_ENCODER_CH3_A</w:t>
-            </w:r>
-          </w:p>
-        </w:tc>
-        <w:tc>
-          <w:tcPr>
-            <w:tcW w:w="0" w:type="auto"/>
-            <w:shd w:val="clear" w:color="auto" w:fill="auto"/>
-            <w:vAlign w:val="center"/>
-          </w:tcPr>
-          <w:p>
-            <w:pPr>
-              <w:keepNext w:val="0"/>
-              <w:keepLines w:val="0"/>
-              <w:widowControl/>
-              <w:suppressLineNumbers w:val="0"/>
-              <w:jc w:val="left"/>
-            </w:pPr>
-            <w:r>
-              <w:rPr>
-                <w:rFonts w:ascii="宋体" w:hAnsi="宋体" w:eastAsia="宋体" w:cs="宋体"/>
-                <w:kern w:val="0"/>
-                <w:sz w:val="24"/>
-                <w:szCs w:val="24"/>
-                <w:lang w:val="en-US" w:eastAsia="zh-CN" w:bidi="ar"/>
-              </w:rPr>
-              <w:t>左后编码器 A 相</w:t>
+              <w:t>BSP/bsp_encoder.h</w:t>
+            </w:r>
+          </w:p>
+        </w:tc>
+        <w:tc>
+          <w:tcPr>
+            <w:tcW w:w="0" w:type="auto"/>
+            <w:shd w:val="clear" w:color="auto" w:fill="auto"/>
+            <w:vAlign w:val="center"/>
+          </w:tcPr>
+          <w:p>
+            <w:pPr>
+              <w:keepNext w:val="0"/>
+              <w:keepLines w:val="0"/>
+              <w:widowControl/>
+              <w:suppressLineNumbers w:val="0"/>
+              <w:jc w:val="left"/>
+            </w:pPr>
+            <w:r>
+              <w:rPr>
+                <w:rFonts w:ascii="宋体" w:hAnsi="宋体" w:eastAsia="宋体" w:cs="宋体"/>
+                <w:kern w:val="0"/>
+                <w:sz w:val="24"/>
+                <w:szCs w:val="24"/>
+                <w:lang w:val="en-US" w:eastAsia="zh-CN" w:bidi="ar"/>
+              </w:rPr>
+              <w:t>仅 4WD 启用；默认 2WD 关闭</w:t>
             </w:r>
           </w:p>
         </w:tc>
@@ -7580,33 +7575,33 @@
                 <w:szCs w:val="24"/>
                 <w:lang w:val="en-US" w:eastAsia="zh-CN" w:bidi="ar"/>
               </w:rPr>
-              <w:t>BSP_ENCODER_CH3_B</w:t>
-            </w:r>
-          </w:p>
-        </w:tc>
-        <w:tc>
-          <w:tcPr>
-            <w:tcW w:w="0" w:type="auto"/>
-            <w:shd w:val="clear" w:color="auto" w:fill="auto"/>
-            <w:vAlign w:val="center"/>
-          </w:tcPr>
-          <w:p>
-            <w:pPr>
-              <w:keepNext w:val="0"/>
-              <w:keepLines w:val="0"/>
-              <w:widowControl/>
-              <w:suppressLineNumbers w:val="0"/>
-              <w:jc w:val="left"/>
-            </w:pPr>
-            <w:r>
-              <w:rPr>
-                <w:rFonts w:ascii="宋体" w:hAnsi="宋体" w:eastAsia="宋体" w:cs="宋体"/>
-                <w:kern w:val="0"/>
-                <w:sz w:val="24"/>
-                <w:szCs w:val="24"/>
-                <w:lang w:val="en-US" w:eastAsia="zh-CN" w:bidi="ar"/>
-              </w:rPr>
-              <w:t>左后编码器 B 相</w:t>
+              <w:t>BSP/bsp_encoder.h</w:t>
+            </w:r>
+          </w:p>
+        </w:tc>
+        <w:tc>
+          <w:tcPr>
+            <w:tcW w:w="0" w:type="auto"/>
+            <w:shd w:val="clear" w:color="auto" w:fill="auto"/>
+            <w:vAlign w:val="center"/>
+          </w:tcPr>
+          <w:p>
+            <w:pPr>
+              <w:keepNext w:val="0"/>
+              <w:keepLines w:val="0"/>
+              <w:widowControl/>
+              <w:suppressLineNumbers w:val="0"/>
+              <w:jc w:val="left"/>
+            </w:pPr>
+            <w:r>
+              <w:rPr>
+                <w:rFonts w:ascii="宋体" w:hAnsi="宋体" w:eastAsia="宋体" w:cs="宋体"/>
+                <w:kern w:val="0"/>
+                <w:sz w:val="24"/>
+                <w:szCs w:val="24"/>
+                <w:lang w:val="en-US" w:eastAsia="zh-CN" w:bidi="ar"/>
+              </w:rPr>
+              <w:t>仅 4WD 启用；默认 2WD 关闭</w:t>
             </w:r>
           </w:p>
         </w:tc>
@@ -7759,33 +7754,33 @@
                 <w:szCs w:val="24"/>
                 <w:lang w:val="en-US" w:eastAsia="zh-CN" w:bidi="ar"/>
               </w:rPr>
-              <w:t>BSP_ENCODER_CH4_A</w:t>
-            </w:r>
-          </w:p>
-        </w:tc>
-        <w:tc>
-          <w:tcPr>
-            <w:tcW w:w="0" w:type="auto"/>
-            <w:shd w:val="clear" w:color="auto" w:fill="auto"/>
-            <w:vAlign w:val="center"/>
-          </w:tcPr>
-          <w:p>
-            <w:pPr>
-              <w:keepNext w:val="0"/>
-              <w:keepLines w:val="0"/>
-              <w:widowControl/>
-              <w:suppressLineNumbers w:val="0"/>
-              <w:jc w:val="left"/>
-            </w:pPr>
-            <w:r>
-              <w:rPr>
-                <w:rFonts w:ascii="宋体" w:hAnsi="宋体" w:eastAsia="宋体" w:cs="宋体"/>
-                <w:kern w:val="0"/>
-                <w:sz w:val="24"/>
-                <w:szCs w:val="24"/>
-                <w:lang w:val="en-US" w:eastAsia="zh-CN" w:bidi="ar"/>
-              </w:rPr>
-              <w:t>右后编码器 A 相</w:t>
+              <w:t>BSP/bsp_encoder.h</w:t>
+            </w:r>
+          </w:p>
+        </w:tc>
+        <w:tc>
+          <w:tcPr>
+            <w:tcW w:w="0" w:type="auto"/>
+            <w:shd w:val="clear" w:color="auto" w:fill="auto"/>
+            <w:vAlign w:val="center"/>
+          </w:tcPr>
+          <w:p>
+            <w:pPr>
+              <w:keepNext w:val="0"/>
+              <w:keepLines w:val="0"/>
+              <w:widowControl/>
+              <w:suppressLineNumbers w:val="0"/>
+              <w:jc w:val="left"/>
+            </w:pPr>
+            <w:r>
+              <w:rPr>
+                <w:rFonts w:ascii="宋体" w:hAnsi="宋体" w:eastAsia="宋体" w:cs="宋体"/>
+                <w:kern w:val="0"/>
+                <w:sz w:val="24"/>
+                <w:szCs w:val="24"/>
+                <w:lang w:val="en-US" w:eastAsia="zh-CN" w:bidi="ar"/>
+              </w:rPr>
+              <w:t>仅 4WD 启用；默认 2WD 关闭</w:t>
             </w:r>
           </w:p>
         </w:tc>
@@ -7938,33 +7933,33 @@
                 <w:szCs w:val="24"/>
                 <w:lang w:val="en-US" w:eastAsia="zh-CN" w:bidi="ar"/>
               </w:rPr>
-              <w:t>BSP_ENCODER_CH4_B</w:t>
-            </w:r>
-          </w:p>
-        </w:tc>
-        <w:tc>
-          <w:tcPr>
-            <w:tcW w:w="0" w:type="auto"/>
-            <w:shd w:val="clear" w:color="auto" w:fill="auto"/>
-            <w:vAlign w:val="center"/>
-          </w:tcPr>
-          <w:p>
-            <w:pPr>
-              <w:keepNext w:val="0"/>
-              <w:keepLines w:val="0"/>
-              <w:widowControl/>
-              <w:suppressLineNumbers w:val="0"/>
-              <w:jc w:val="left"/>
-            </w:pPr>
-            <w:r>
-              <w:rPr>
-                <w:rFonts w:ascii="宋体" w:hAnsi="宋体" w:eastAsia="宋体" w:cs="宋体"/>
-                <w:kern w:val="0"/>
-                <w:sz w:val="24"/>
-                <w:szCs w:val="24"/>
-                <w:lang w:val="en-US" w:eastAsia="zh-CN" w:bidi="ar"/>
-              </w:rPr>
-              <w:t>右后编码器 B 相</w:t>
+              <w:t>BSP/bsp_encoder.h</w:t>
+            </w:r>
+          </w:p>
+        </w:tc>
+        <w:tc>
+          <w:tcPr>
+            <w:tcW w:w="0" w:type="auto"/>
+            <w:shd w:val="clear" w:color="auto" w:fill="auto"/>
+            <w:vAlign w:val="center"/>
+          </w:tcPr>
+          <w:p>
+            <w:pPr>
+              <w:keepNext w:val="0"/>
+              <w:keepLines w:val="0"/>
+              <w:widowControl/>
+              <w:suppressLineNumbers w:val="0"/>
+              <w:jc w:val="left"/>
+            </w:pPr>
+            <w:r>
+              <w:rPr>
+                <w:rFonts w:ascii="宋体" w:hAnsi="宋体" w:eastAsia="宋体" w:cs="宋体"/>
+                <w:kern w:val="0"/>
+                <w:sz w:val="24"/>
+                <w:szCs w:val="24"/>
+                <w:lang w:val="en-US" w:eastAsia="zh-CN" w:bidi="ar"/>
+              </w:rPr>
+              <w:t>仅 4WD 启用；默认 2WD 关闭</w:t>
             </w:r>
           </w:p>
         </w:tc>
@@ -8143,7 +8138,7 @@
                 <w:szCs w:val="24"/>
                 <w:lang w:val="en-US" w:eastAsia="zh-CN" w:bidi="ar"/>
               </w:rPr>
-              <w:t>8 路灰度共用 1 路 ADC</w:t>
+              <w:t>仅 GRAY_SENSOR_SOURCE_4051 模式使用；当前默认 MCU-I2C 模式</w:t>
             </w:r>
           </w:p>
         </w:tc>
@@ -8322,7 +8317,7 @@
                 <w:szCs w:val="24"/>
                 <w:lang w:val="en-US" w:eastAsia="zh-CN" w:bidi="ar"/>
               </w:rPr>
-              <w:t>4051 地址选择低位</w:t>
+              <w:t>仅 GRAY_SENSOR_SOURCE_4051 模式使用；当前默认 MCU-I2C 模式</w:t>
             </w:r>
           </w:p>
         </w:tc>
@@ -8501,7 +8496,7 @@
                 <w:szCs w:val="24"/>
                 <w:lang w:val="en-US" w:eastAsia="zh-CN" w:bidi="ar"/>
               </w:rPr>
-              <w:t>4051 地址选择中位</w:t>
+              <w:t>仅 GRAY_SENSOR_SOURCE_4051 模式使用；当前默认 MCU-I2C 模式</w:t>
             </w:r>
           </w:p>
         </w:tc>
@@ -8679,7 +8674,7 @@
                 <w:szCs w:val="24"/>
                 <w:lang w:val="en-US" w:eastAsia="zh-CN" w:bidi="ar"/>
               </w:rPr>
-              <w:t>4051 地址选择高位</w:t>
+              <w:t>仅 GRAY_SENSOR_SOURCE_4051 模式使用；当前默认 MCU-I2C 模式</w:t>
             </w:r>
           </w:p>
         </w:tc>
@@ -8856,7 +8851,7 @@
                 <w:szCs w:val="24"/>
                 <w:lang w:val="en-US" w:eastAsia="zh-CN" w:bidi="ar"/>
               </w:rPr>
-              <w:t>低电平使能，直接接 GND</w:t>
+              <w:t>仅 GRAY_SENSOR_SOURCE_4051 模式使用；当前默认 MCU-I2C 模式</w:t>
             </w:r>
           </w:p>
         </w:tc>
@@ -9008,33 +9003,33 @@
                 <w:szCs w:val="24"/>
                 <w:lang w:val="en-US" w:eastAsia="zh-CN" w:bidi="ar"/>
               </w:rPr>
-              <w:t>I2C_BUS1_SCL</w:t>
-            </w:r>
-          </w:p>
-        </w:tc>
-        <w:tc>
-          <w:tcPr>
-            <w:tcW w:w="0" w:type="auto"/>
-            <w:shd w:val="clear" w:color="auto" w:fill="auto"/>
-            <w:vAlign w:val="center"/>
-          </w:tcPr>
-          <w:p>
-            <w:pPr>
-              <w:keepNext w:val="0"/>
-              <w:keepLines w:val="0"/>
-              <w:widowControl/>
-              <w:suppressLineNumbers w:val="0"/>
-              <w:jc w:val="left"/>
-            </w:pPr>
-            <w:r>
-              <w:rPr>
-                <w:rFonts w:ascii="宋体" w:hAnsi="宋体" w:eastAsia="宋体" w:cs="宋体"/>
-                <w:kern w:val="0"/>
-                <w:sz w:val="24"/>
-                <w:szCs w:val="24"/>
-                <w:lang w:val="en-US" w:eastAsia="zh-CN" w:bidi="ar"/>
-              </w:rPr>
-              <w:t>当前启用，后续可接 IMU/OLED/ToF</w:t>
+              <w:t>BSP/bsp_i2c.h</w:t>
+            </w:r>
+          </w:p>
+        </w:tc>
+        <w:tc>
+          <w:tcPr>
+            <w:tcW w:w="0" w:type="auto"/>
+            <w:shd w:val="clear" w:color="auto" w:fill="auto"/>
+            <w:vAlign w:val="center"/>
+          </w:tcPr>
+          <w:p>
+            <w:pPr>
+              <w:keepNext w:val="0"/>
+              <w:keepLines w:val="0"/>
+              <w:widowControl/>
+              <w:suppressLineNumbers w:val="0"/>
+              <w:jc w:val="left"/>
+            </w:pPr>
+            <w:r>
+              <w:rPr>
+                <w:rFonts w:ascii="宋体" w:hAnsi="宋体" w:eastAsia="宋体" w:cs="宋体"/>
+                <w:kern w:val="0"/>
+                <w:sz w:val="24"/>
+                <w:szCs w:val="24"/>
+                <w:lang w:val="en-US" w:eastAsia="zh-CN" w:bidi="ar"/>
+              </w:rPr>
+              <w:t>I2C1 共享：MCU 灰度、OLED、VL53L1X</w:t>
             </w:r>
           </w:p>
         </w:tc>
@@ -9187,33 +9182,33 @@
                 <w:szCs w:val="24"/>
                 <w:lang w:val="en-US" w:eastAsia="zh-CN" w:bidi="ar"/>
               </w:rPr>
-              <w:t>I2C_BUS1_SDA</w:t>
-            </w:r>
-          </w:p>
-        </w:tc>
-        <w:tc>
-          <w:tcPr>
-            <w:tcW w:w="0" w:type="auto"/>
-            <w:shd w:val="clear" w:color="auto" w:fill="auto"/>
-            <w:vAlign w:val="center"/>
-          </w:tcPr>
-          <w:p>
-            <w:pPr>
-              <w:keepNext w:val="0"/>
-              <w:keepLines w:val="0"/>
-              <w:widowControl/>
-              <w:suppressLineNumbers w:val="0"/>
-              <w:jc w:val="left"/>
-            </w:pPr>
-            <w:r>
-              <w:rPr>
-                <w:rFonts w:ascii="宋体" w:hAnsi="宋体" w:eastAsia="宋体" w:cs="宋体"/>
-                <w:kern w:val="0"/>
-                <w:sz w:val="24"/>
-                <w:szCs w:val="24"/>
-                <w:lang w:val="en-US" w:eastAsia="zh-CN" w:bidi="ar"/>
-              </w:rPr>
-              <w:t>当前启用，后续可接 IMU/OLED/ToF</w:t>
+              <w:t>BSP/bsp_i2c.h</w:t>
+            </w:r>
+          </w:p>
+        </w:tc>
+        <w:tc>
+          <w:tcPr>
+            <w:tcW w:w="0" w:type="auto"/>
+            <w:shd w:val="clear" w:color="auto" w:fill="auto"/>
+            <w:vAlign w:val="center"/>
+          </w:tcPr>
+          <w:p>
+            <w:pPr>
+              <w:keepNext w:val="0"/>
+              <w:keepLines w:val="0"/>
+              <w:widowControl/>
+              <w:suppressLineNumbers w:val="0"/>
+              <w:jc w:val="left"/>
+            </w:pPr>
+            <w:r>
+              <w:rPr>
+                <w:rFonts w:ascii="宋体" w:hAnsi="宋体" w:eastAsia="宋体" w:cs="宋体"/>
+                <w:kern w:val="0"/>
+                <w:sz w:val="24"/>
+                <w:szCs w:val="24"/>
+                <w:lang w:val="en-US" w:eastAsia="zh-CN" w:bidi="ar"/>
+              </w:rPr>
+              <w:t>I2C1 共享：MCU 灰度、OLED、VL53L1X</w:t>
             </w:r>
           </w:p>
         </w:tc>
@@ -9286,7 +9281,7 @@
                 <w:szCs w:val="24"/>
                 <w:lang w:val="en-US" w:eastAsia="zh-CN" w:bidi="ar"/>
               </w:rPr>
-              <w:t>SPI2_CS</w:t>
+              <w:t>LCD_CS</w:t>
             </w:r>
           </w:p>
         </w:tc>
@@ -9365,33 +9360,33 @@
                 <w:szCs w:val="24"/>
                 <w:lang w:val="en-US" w:eastAsia="zh-CN" w:bidi="ar"/>
               </w:rPr>
-              <w:t>BSP_GPIO_CH2</w:t>
-            </w:r>
-          </w:p>
-        </w:tc>
-        <w:tc>
-          <w:tcPr>
-            <w:tcW w:w="0" w:type="auto"/>
-            <w:shd w:val="clear" w:color="auto" w:fill="auto"/>
-            <w:vAlign w:val="center"/>
-          </w:tcPr>
-          <w:p>
-            <w:pPr>
-              <w:keepNext w:val="0"/>
-              <w:keepLines w:val="0"/>
-              <w:widowControl/>
-              <w:suppressLineNumbers w:val="0"/>
-              <w:jc w:val="left"/>
-            </w:pPr>
-            <w:r>
-              <w:rPr>
-                <w:rFonts w:ascii="宋体" w:hAnsi="宋体" w:eastAsia="宋体" w:cs="宋体"/>
-                <w:kern w:val="0"/>
-                <w:sz w:val="24"/>
-                <w:szCs w:val="24"/>
-                <w:lang w:val="en-US" w:eastAsia="zh-CN" w:bidi="ar"/>
-              </w:rPr>
-              <w:t>SPI2 默认片选脚</w:t>
+              <w:t>BSP_GPIO_LCD_CS</w:t>
+            </w:r>
+          </w:p>
+        </w:tc>
+        <w:tc>
+          <w:tcPr>
+            <w:tcW w:w="0" w:type="auto"/>
+            <w:shd w:val="clear" w:color="auto" w:fill="auto"/>
+            <w:vAlign w:val="center"/>
+          </w:tcPr>
+          <w:p>
+            <w:pPr>
+              <w:keepNext w:val="0"/>
+              <w:keepLines w:val="0"/>
+              <w:widowControl/>
+              <w:suppressLineNumbers w:val="0"/>
+              <w:jc w:val="left"/>
+            </w:pPr>
+            <w:r>
+              <w:rPr>
+                <w:rFonts w:ascii="宋体" w:hAnsi="宋体" w:eastAsia="宋体" w:cs="宋体"/>
+                <w:kern w:val="0"/>
+                <w:sz w:val="24"/>
+                <w:szCs w:val="24"/>
+                <w:lang w:val="en-US" w:eastAsia="zh-CN" w:bidi="ar"/>
+              </w:rPr>
+              <w:t>LCD 独立片选；2WD/4WD 均使用</w:t>
             </w:r>
           </w:p>
         </w:tc>
@@ -9544,33 +9539,33 @@
                 <w:szCs w:val="24"/>
                 <w:lang w:val="en-US" w:eastAsia="zh-CN" w:bidi="ar"/>
               </w:rPr>
-              <w:t>SPI_BUS2_SCK</w:t>
-            </w:r>
-          </w:p>
-        </w:tc>
-        <w:tc>
-          <w:tcPr>
-            <w:tcW w:w="0" w:type="auto"/>
-            <w:shd w:val="clear" w:color="auto" w:fill="auto"/>
-            <w:vAlign w:val="center"/>
-          </w:tcPr>
-          <w:p>
-            <w:pPr>
-              <w:keepNext w:val="0"/>
-              <w:keepLines w:val="0"/>
-              <w:widowControl/>
-              <w:suppressLineNumbers w:val="0"/>
-              <w:jc w:val="left"/>
-            </w:pPr>
-            <w:r>
-              <w:rPr>
-                <w:rFonts w:ascii="宋体" w:hAnsi="宋体" w:eastAsia="宋体" w:cs="宋体"/>
-                <w:kern w:val="0"/>
-                <w:sz w:val="24"/>
-                <w:szCs w:val="24"/>
-                <w:lang w:val="en-US" w:eastAsia="zh-CN" w:bidi="ar"/>
-              </w:rPr>
-              <w:t>当前启用</w:t>
+              <w:t>BSP/bsp_spi.h</w:t>
+            </w:r>
+          </w:p>
+        </w:tc>
+        <w:tc>
+          <w:tcPr>
+            <w:tcW w:w="0" w:type="auto"/>
+            <w:shd w:val="clear" w:color="auto" w:fill="auto"/>
+            <w:vAlign w:val="center"/>
+          </w:tcPr>
+          <w:p>
+            <w:pPr>
+              <w:keepNext w:val="0"/>
+              <w:keepLines w:val="0"/>
+              <w:widowControl/>
+              <w:suppressLineNumbers w:val="0"/>
+              <w:jc w:val="left"/>
+            </w:pPr>
+            <w:r>
+              <w:rPr>
+                <w:rFonts w:ascii="宋体" w:hAnsi="宋体" w:eastAsia="宋体" w:cs="宋体"/>
+                <w:kern w:val="0"/>
+                <w:sz w:val="24"/>
+                <w:szCs w:val="24"/>
+                <w:lang w:val="en-US" w:eastAsia="zh-CN" w:bidi="ar"/>
+              </w:rPr>
+              <w:t>ICM-20948；4WD 时 LCD 也共用 SPI2</w:t>
             </w:r>
           </w:p>
         </w:tc>
@@ -9723,33 +9718,33 @@
                 <w:szCs w:val="24"/>
                 <w:lang w:val="en-US" w:eastAsia="zh-CN" w:bidi="ar"/>
               </w:rPr>
-              <w:t>SPI_BUS2_MISO</w:t>
-            </w:r>
-          </w:p>
-        </w:tc>
-        <w:tc>
-          <w:tcPr>
-            <w:tcW w:w="0" w:type="auto"/>
-            <w:shd w:val="clear" w:color="auto" w:fill="auto"/>
-            <w:vAlign w:val="center"/>
-          </w:tcPr>
-          <w:p>
-            <w:pPr>
-              <w:keepNext w:val="0"/>
-              <w:keepLines w:val="0"/>
-              <w:widowControl/>
-              <w:suppressLineNumbers w:val="0"/>
-              <w:jc w:val="left"/>
-            </w:pPr>
-            <w:r>
-              <w:rPr>
-                <w:rFonts w:ascii="宋体" w:hAnsi="宋体" w:eastAsia="宋体" w:cs="宋体"/>
-                <w:kern w:val="0"/>
-                <w:sz w:val="24"/>
-                <w:szCs w:val="24"/>
-                <w:lang w:val="en-US" w:eastAsia="zh-CN" w:bidi="ar"/>
-              </w:rPr>
-              <w:t>当前启用</w:t>
+              <w:t>BSP/bsp_spi.h</w:t>
+            </w:r>
+          </w:p>
+        </w:tc>
+        <w:tc>
+          <w:tcPr>
+            <w:tcW w:w="0" w:type="auto"/>
+            <w:shd w:val="clear" w:color="auto" w:fill="auto"/>
+            <w:vAlign w:val="center"/>
+          </w:tcPr>
+          <w:p>
+            <w:pPr>
+              <w:keepNext w:val="0"/>
+              <w:keepLines w:val="0"/>
+              <w:widowControl/>
+              <w:suppressLineNumbers w:val="0"/>
+              <w:jc w:val="left"/>
+            </w:pPr>
+            <w:r>
+              <w:rPr>
+                <w:rFonts w:ascii="宋体" w:hAnsi="宋体" w:eastAsia="宋体" w:cs="宋体"/>
+                <w:kern w:val="0"/>
+                <w:sz w:val="24"/>
+                <w:szCs w:val="24"/>
+                <w:lang w:val="en-US" w:eastAsia="zh-CN" w:bidi="ar"/>
+              </w:rPr>
+              <w:t>ICM-20948；4WD 时 LCD 也共用 SPI2</w:t>
             </w:r>
           </w:p>
         </w:tc>
@@ -9902,33 +9897,33 @@
                 <w:szCs w:val="24"/>
                 <w:lang w:val="en-US" w:eastAsia="zh-CN" w:bidi="ar"/>
               </w:rPr>
-              <w:t>SPI_BUS2_MOSI</w:t>
-            </w:r>
-          </w:p>
-        </w:tc>
-        <w:tc>
-          <w:tcPr>
-            <w:tcW w:w="0" w:type="auto"/>
-            <w:shd w:val="clear" w:color="auto" w:fill="auto"/>
-            <w:vAlign w:val="center"/>
-          </w:tcPr>
-          <w:p>
-            <w:pPr>
-              <w:keepNext w:val="0"/>
-              <w:keepLines w:val="0"/>
-              <w:widowControl/>
-              <w:suppressLineNumbers w:val="0"/>
-              <w:jc w:val="left"/>
-            </w:pPr>
-            <w:r>
-              <w:rPr>
-                <w:rFonts w:ascii="宋体" w:hAnsi="宋体" w:eastAsia="宋体" w:cs="宋体"/>
-                <w:kern w:val="0"/>
-                <w:sz w:val="24"/>
-                <w:szCs w:val="24"/>
-                <w:lang w:val="en-US" w:eastAsia="zh-CN" w:bidi="ar"/>
-              </w:rPr>
-              <w:t>当前启用</w:t>
+              <w:t>BSP/bsp_spi.h</w:t>
+            </w:r>
+          </w:p>
+        </w:tc>
+        <w:tc>
+          <w:tcPr>
+            <w:tcW w:w="0" w:type="auto"/>
+            <w:shd w:val="clear" w:color="auto" w:fill="auto"/>
+            <w:vAlign w:val="center"/>
+          </w:tcPr>
+          <w:p>
+            <w:pPr>
+              <w:keepNext w:val="0"/>
+              <w:keepLines w:val="0"/>
+              <w:widowControl/>
+              <w:suppressLineNumbers w:val="0"/>
+              <w:jc w:val="left"/>
+            </w:pPr>
+            <w:r>
+              <w:rPr>
+                <w:rFonts w:ascii="宋体" w:hAnsi="宋体" w:eastAsia="宋体" w:cs="宋体"/>
+                <w:kern w:val="0"/>
+                <w:sz w:val="24"/>
+                <w:szCs w:val="24"/>
+                <w:lang w:val="en-US" w:eastAsia="zh-CN" w:bidi="ar"/>
+              </w:rPr>
+              <w:t>ICM-20948；4WD 时 LCD 也共用 SPI2</w:t>
             </w:r>
           </w:p>
         </w:tc>
@@ -11217,7 +11212,7 @@
         <w:suppressLineNumbers w:val="0"/>
       </w:pPr>
       <w:r>
-        <w:t>二、代码里预留但默认关闭的引脚</w:t>
+        <w:t>二、条件启用或默认关闭的复用资源</w:t>
       </w:r>
     </w:p>
     <w:tbl>
@@ -13034,33 +13029,33 @@
                 <w:szCs w:val="24"/>
                 <w:lang w:val="en-US" w:eastAsia="zh-CN" w:bidi="ar"/>
               </w:rPr>
-              <w:t>关闭</w:t>
-            </w:r>
-          </w:p>
-        </w:tc>
-        <w:tc>
-          <w:tcPr>
-            <w:tcW w:w="0" w:type="auto"/>
-            <w:shd w:val="clear" w:color="auto" w:fill="auto"/>
-            <w:vAlign w:val="center"/>
-          </w:tcPr>
-          <w:p>
-            <w:pPr>
-              <w:keepNext w:val="0"/>
-              <w:keepLines w:val="0"/>
-              <w:widowControl/>
-              <w:suppressLineNumbers w:val="0"/>
-              <w:jc w:val="left"/>
-            </w:pPr>
-            <w:r>
-              <w:rPr>
-                <w:rFonts w:ascii="宋体" w:hAnsi="宋体" w:eastAsia="宋体" w:cs="宋体"/>
-                <w:kern w:val="0"/>
-                <w:sz w:val="24"/>
-                <w:szCs w:val="24"/>
-                <w:lang w:val="en-US" w:eastAsia="zh-CN" w:bidi="ar"/>
-              </w:rPr>
-              <w:t>PA6/PA7 已被编码器占用，所以 SPI1 不推荐</w:t>
+              <w:t>2WD 启用；4WD 关闭</w:t>
+            </w:r>
+          </w:p>
+        </w:tc>
+        <w:tc>
+          <w:tcPr>
+            <w:tcW w:w="0" w:type="auto"/>
+            <w:shd w:val="clear" w:color="auto" w:fill="auto"/>
+            <w:vAlign w:val="center"/>
+          </w:tcPr>
+          <w:p>
+            <w:pPr>
+              <w:keepNext w:val="0"/>
+              <w:keepLines w:val="0"/>
+              <w:widowControl/>
+              <w:suppressLineNumbers w:val="0"/>
+              <w:jc w:val="left"/>
+            </w:pPr>
+            <w:r>
+              <w:rPr>
+                <w:rFonts w:ascii="宋体" w:hAnsi="宋体" w:eastAsia="宋体" w:cs="宋体"/>
+                <w:kern w:val="0"/>
+                <w:sz w:val="24"/>
+                <w:szCs w:val="24"/>
+                <w:lang w:val="en-US" w:eastAsia="zh-CN" w:bidi="ar"/>
+              </w:rPr>
+              <w:t>2WD 用于 LCD；4WD 时 PA6/PA7 被后编码器占用</w:t>
             </w:r>
           </w:p>
         </w:tc>
@@ -13211,33 +13206,33 @@
                 <w:szCs w:val="24"/>
                 <w:lang w:val="en-US" w:eastAsia="zh-CN" w:bidi="ar"/>
               </w:rPr>
-              <w:t>关闭</w:t>
-            </w:r>
-          </w:p>
-        </w:tc>
-        <w:tc>
-          <w:tcPr>
-            <w:tcW w:w="0" w:type="auto"/>
-            <w:shd w:val="clear" w:color="auto" w:fill="auto"/>
-            <w:vAlign w:val="center"/>
-          </w:tcPr>
-          <w:p>
-            <w:pPr>
-              <w:keepNext w:val="0"/>
-              <w:keepLines w:val="0"/>
-              <w:widowControl/>
-              <w:suppressLineNumbers w:val="0"/>
-              <w:jc w:val="left"/>
-            </w:pPr>
-            <w:r>
-              <w:rPr>
-                <w:rFonts w:ascii="宋体" w:hAnsi="宋体" w:eastAsia="宋体" w:cs="宋体"/>
-                <w:kern w:val="0"/>
-                <w:sz w:val="24"/>
-                <w:szCs w:val="24"/>
-                <w:lang w:val="en-US" w:eastAsia="zh-CN" w:bidi="ar"/>
-              </w:rPr>
-              <w:t>已被 RL_ENC_A 占用</w:t>
+              <w:t>2WD 启用；4WD 关闭</w:t>
+            </w:r>
+          </w:p>
+        </w:tc>
+        <w:tc>
+          <w:tcPr>
+            <w:tcW w:w="0" w:type="auto"/>
+            <w:shd w:val="clear" w:color="auto" w:fill="auto"/>
+            <w:vAlign w:val="center"/>
+          </w:tcPr>
+          <w:p>
+            <w:pPr>
+              <w:keepNext w:val="0"/>
+              <w:keepLines w:val="0"/>
+              <w:widowControl/>
+              <w:suppressLineNumbers w:val="0"/>
+              <w:jc w:val="left"/>
+            </w:pPr>
+            <w:r>
+              <w:rPr>
+                <w:rFonts w:ascii="宋体" w:hAnsi="宋体" w:eastAsia="宋体" w:cs="宋体"/>
+                <w:kern w:val="0"/>
+                <w:sz w:val="24"/>
+                <w:szCs w:val="24"/>
+                <w:lang w:val="en-US" w:eastAsia="zh-CN" w:bidi="ar"/>
+              </w:rPr>
+              <w:t>2WD 用于 LCD；4WD 时 PA6/PA7 被后编码器占用</w:t>
             </w:r>
           </w:p>
         </w:tc>
@@ -13388,33 +13383,33 @@
                 <w:szCs w:val="24"/>
                 <w:lang w:val="en-US" w:eastAsia="zh-CN" w:bidi="ar"/>
               </w:rPr>
-              <w:t>关闭</w:t>
-            </w:r>
-          </w:p>
-        </w:tc>
-        <w:tc>
-          <w:tcPr>
-            <w:tcW w:w="0" w:type="auto"/>
-            <w:shd w:val="clear" w:color="auto" w:fill="auto"/>
-            <w:vAlign w:val="center"/>
-          </w:tcPr>
-          <w:p>
-            <w:pPr>
-              <w:keepNext w:val="0"/>
-              <w:keepLines w:val="0"/>
-              <w:widowControl/>
-              <w:suppressLineNumbers w:val="0"/>
-              <w:jc w:val="left"/>
-            </w:pPr>
-            <w:r>
-              <w:rPr>
-                <w:rFonts w:ascii="宋体" w:hAnsi="宋体" w:eastAsia="宋体" w:cs="宋体"/>
-                <w:kern w:val="0"/>
-                <w:sz w:val="24"/>
-                <w:szCs w:val="24"/>
-                <w:lang w:val="en-US" w:eastAsia="zh-CN" w:bidi="ar"/>
-              </w:rPr>
-              <w:t>已被 RL_ENC_B 占用</w:t>
+              <w:t>2WD 启用；4WD 关闭</w:t>
+            </w:r>
+          </w:p>
+        </w:tc>
+        <w:tc>
+          <w:tcPr>
+            <w:tcW w:w="0" w:type="auto"/>
+            <w:shd w:val="clear" w:color="auto" w:fill="auto"/>
+            <w:vAlign w:val="center"/>
+          </w:tcPr>
+          <w:p>
+            <w:pPr>
+              <w:keepNext w:val="0"/>
+              <w:keepLines w:val="0"/>
+              <w:widowControl/>
+              <w:suppressLineNumbers w:val="0"/>
+              <w:jc w:val="left"/>
+            </w:pPr>
+            <w:r>
+              <w:rPr>
+                <w:rFonts w:ascii="宋体" w:hAnsi="宋体" w:eastAsia="宋体" w:cs="宋体"/>
+                <w:kern w:val="0"/>
+                <w:sz w:val="24"/>
+                <w:szCs w:val="24"/>
+                <w:lang w:val="en-US" w:eastAsia="zh-CN" w:bidi="ar"/>
+              </w:rPr>
+              <w:t>2WD 用于 LCD；4WD 时 PA6/PA7 被后编码器占用</w:t>
             </w:r>
           </w:p>
         </w:tc>
@@ -13591,7 +13586,7 @@
                 <w:szCs w:val="24"/>
                 <w:lang w:val="en-US" w:eastAsia="zh-CN" w:bidi="ar"/>
               </w:rPr>
-              <w:t>备用</w:t>
+              <w:t>PC10 当前用于 LCD_DC，不是空闲 SPI3 引脚</w:t>
             </w:r>
           </w:p>
         </w:tc>
@@ -13768,7 +13763,7 @@
                 <w:szCs w:val="24"/>
                 <w:lang w:val="en-US" w:eastAsia="zh-CN" w:bidi="ar"/>
               </w:rPr>
-              <w:t>备用</w:t>
+              <w:t>PC11 当前用于 LCD_BL，不是空闲 SPI3 引脚</w:t>
             </w:r>
           </w:p>
         </w:tc>
@@ -14658,7 +14653,7 @@
                 <w:szCs w:val="24"/>
                 <w:lang w:val="en-US" w:eastAsia="zh-CN" w:bidi="ar"/>
               </w:rPr>
-              <w:t>已被 RR_PWM 占用，不建议启用</w:t>
+              <w:t>4WD 与 RR_PWM 冲突；2WD 下仍需核对其他复用</w:t>
             </w:r>
           </w:p>
         </w:tc>
@@ -15723,7 +15718,7 @@
                 <w:szCs w:val="24"/>
                 <w:lang w:val="en-US" w:eastAsia="zh-CN" w:bidi="ar"/>
               </w:rPr>
-              <w:t>已被 RL_ENC_A 占用</w:t>
+              <w:t>2WD 用作 SPI1_MISO；4WD 用作 RL_ENCODER_A</w:t>
             </w:r>
           </w:p>
         </w:tc>
@@ -15900,7 +15895,7 @@
                 <w:szCs w:val="24"/>
                 <w:lang w:val="en-US" w:eastAsia="zh-CN" w:bidi="ar"/>
               </w:rPr>
-              <w:t>已被 RL_ENC_B 占用</w:t>
+              <w:t>2WD 用作 SPI1_MOSI；4WD 用作 RL_ENCODER_B</w:t>
             </w:r>
           </w:p>
         </w:tc>
@@ -16051,33 +16046,33 @@
                 <w:szCs w:val="24"/>
                 <w:lang w:val="en-US" w:eastAsia="zh-CN" w:bidi="ar"/>
               </w:rPr>
-              <w:t>关闭</w:t>
-            </w:r>
-          </w:p>
-        </w:tc>
-        <w:tc>
-          <w:tcPr>
-            <w:tcW w:w="0" w:type="auto"/>
-            <w:shd w:val="clear" w:color="auto" w:fill="auto"/>
-            <w:vAlign w:val="center"/>
-          </w:tcPr>
-          <w:p>
-            <w:pPr>
-              <w:keepNext w:val="0"/>
-              <w:keepLines w:val="0"/>
-              <w:widowControl/>
-              <w:suppressLineNumbers w:val="0"/>
-              <w:jc w:val="left"/>
-            </w:pPr>
-            <w:r>
-              <w:rPr>
-                <w:rFonts w:ascii="宋体" w:hAnsi="宋体" w:eastAsia="宋体" w:cs="宋体"/>
-                <w:kern w:val="0"/>
-                <w:sz w:val="24"/>
-                <w:szCs w:val="24"/>
-                <w:lang w:val="en-US" w:eastAsia="zh-CN" w:bidi="ar"/>
-              </w:rPr>
-              <w:t>可做限位/超声波 Echo 等</w:t>
+              <w:t>启用</w:t>
+            </w:r>
+          </w:p>
+        </w:tc>
+        <w:tc>
+          <w:tcPr>
+            <w:tcW w:w="0" w:type="auto"/>
+            <w:shd w:val="clear" w:color="auto" w:fill="auto"/>
+            <w:vAlign w:val="center"/>
+          </w:tcPr>
+          <w:p>
+            <w:pPr>
+              <w:keepNext w:val="0"/>
+              <w:keepLines w:val="0"/>
+              <w:widowControl/>
+              <w:suppressLineNumbers w:val="0"/>
+              <w:jc w:val="left"/>
+            </w:pPr>
+            <w:r>
+              <w:rPr>
+                <w:rFonts w:ascii="宋体" w:hAnsi="宋体" w:eastAsia="宋体" w:cs="宋体"/>
+                <w:kern w:val="0"/>
+                <w:sz w:val="24"/>
+                <w:szCs w:val="24"/>
+                <w:lang w:val="en-US" w:eastAsia="zh-CN" w:bidi="ar"/>
+              </w:rPr>
+              <w:t>BSP_EXTI_CH1_ENABLE=1；PE0 为当前通用外部中断输入</w:t>
             </w:r>
           </w:p>
         </w:tc>
@@ -16472,7 +16467,7 @@
         <w:suppressLineNumbers w:val="0"/>
       </w:pPr>
       <w:r>
-        <w:t>三、目前没有分配但后面可能需要补的引脚</w:t>
+        <w:t>三、需要额外确认或尚未完整分配的信号</w:t>
       </w:r>
     </w:p>
     <w:tbl>
@@ -16750,7 +16745,7 @@
                 <w:szCs w:val="24"/>
                 <w:lang w:val="en-US" w:eastAsia="zh-CN" w:bidi="ar"/>
               </w:rPr>
-              <w:t>代码里还没单独分配</w:t>
+              <w:t>未分配；硬件连接待确认</w:t>
             </w:r>
           </w:p>
         </w:tc>
@@ -16850,59 +16845,59 @@
                 <w:szCs w:val="24"/>
                 <w:lang w:val="en-US" w:eastAsia="zh-CN" w:bidi="ar"/>
               </w:rPr>
-              <w:t>DC / RES / BL / CS</w:t>
-            </w:r>
-          </w:p>
-        </w:tc>
-        <w:tc>
-          <w:tcPr>
-            <w:tcW w:w="0" w:type="auto"/>
-            <w:shd w:val="clear" w:color="auto" w:fill="auto"/>
-            <w:vAlign w:val="center"/>
-          </w:tcPr>
-          <w:p>
-            <w:pPr>
-              <w:keepNext w:val="0"/>
-              <w:keepLines w:val="0"/>
-              <w:widowControl/>
-              <w:suppressLineNumbers w:val="0"/>
-              <w:jc w:val="left"/>
-            </w:pPr>
-            <w:r>
-              <w:rPr>
-                <w:rFonts w:ascii="宋体" w:hAnsi="宋体" w:eastAsia="宋体" w:cs="宋体"/>
-                <w:kern w:val="0"/>
-                <w:sz w:val="24"/>
-                <w:szCs w:val="24"/>
-                <w:lang w:val="en-US" w:eastAsia="zh-CN" w:bidi="ar"/>
-              </w:rPr>
-              <w:t>目前只默认有 PB12 作为 SPI2_CS</w:t>
-            </w:r>
-          </w:p>
-        </w:tc>
-        <w:tc>
-          <w:tcPr>
-            <w:tcW w:w="0" w:type="auto"/>
-            <w:shd w:val="clear" w:color="auto" w:fill="auto"/>
-            <w:vAlign w:val="center"/>
-          </w:tcPr>
-          <w:p>
-            <w:pPr>
-              <w:keepNext w:val="0"/>
-              <w:keepLines w:val="0"/>
-              <w:widowControl/>
-              <w:suppressLineNumbers w:val="0"/>
-              <w:jc w:val="left"/>
-            </w:pPr>
-            <w:r>
-              <w:rPr>
-                <w:rFonts w:ascii="宋体" w:hAnsi="宋体" w:eastAsia="宋体" w:cs="宋体"/>
-                <w:kern w:val="0"/>
-                <w:sz w:val="24"/>
-                <w:szCs w:val="24"/>
-                <w:lang w:val="en-US" w:eastAsia="zh-CN" w:bidi="ar"/>
-              </w:rPr>
-              <w:t>如果 LCD 需要 DC、BL，需要继续新增 GPIO</w:t>
+              <w:t>SCK/MOSI/MISO/CS/DC/RES/BL</w:t>
+            </w:r>
+          </w:p>
+        </w:tc>
+        <w:tc>
+          <w:tcPr>
+            <w:tcW w:w="0" w:type="auto"/>
+            <w:shd w:val="clear" w:color="auto" w:fill="auto"/>
+            <w:vAlign w:val="center"/>
+          </w:tcPr>
+          <w:p>
+            <w:pPr>
+              <w:keepNext w:val="0"/>
+              <w:keepLines w:val="0"/>
+              <w:widowControl/>
+              <w:suppressLineNumbers w:val="0"/>
+              <w:jc w:val="left"/>
+            </w:pPr>
+            <w:r>
+              <w:rPr>
+                <w:rFonts w:ascii="宋体" w:hAnsi="宋体" w:eastAsia="宋体" w:cs="宋体"/>
+                <w:kern w:val="0"/>
+                <w:sz w:val="24"/>
+                <w:szCs w:val="24"/>
+                <w:lang w:val="en-US" w:eastAsia="zh-CN" w:bidi="ar"/>
+              </w:rPr>
+              <w:t>CS=PB12、DC=PC10、BL=PC11；RES/RST 未分配</w:t>
+            </w:r>
+          </w:p>
+        </w:tc>
+        <w:tc>
+          <w:tcPr>
+            <w:tcW w:w="0" w:type="auto"/>
+            <w:shd w:val="clear" w:color="auto" w:fill="auto"/>
+            <w:vAlign w:val="center"/>
+          </w:tcPr>
+          <w:p>
+            <w:pPr>
+              <w:keepNext w:val="0"/>
+              <w:keepLines w:val="0"/>
+              <w:widowControl/>
+              <w:suppressLineNumbers w:val="0"/>
+              <w:jc w:val="left"/>
+            </w:pPr>
+            <w:r>
+              <w:rPr>
+                <w:rFonts w:ascii="宋体" w:hAnsi="宋体" w:eastAsia="宋体" w:cs="宋体"/>
+                <w:kern w:val="0"/>
+                <w:sz w:val="24"/>
+                <w:szCs w:val="24"/>
+                <w:lang w:val="en-US" w:eastAsia="zh-CN" w:bidi="ar"/>
+              </w:rPr>
+              <w:t>2WD 使用 SPI1；4WD 当前改用 SPI2 与 ICM 共线，联合验证前建议关闭 LCD_UI_ENABLE</w:t>
             </w:r>
           </w:p>
         </w:tc>
@@ -17002,33 +16997,33 @@
                 <w:szCs w:val="24"/>
                 <w:lang w:val="en-US" w:eastAsia="zh-CN" w:bidi="ar"/>
               </w:rPr>
-              <w:t>当前只有 PB12 一个默认 CS</w:t>
-            </w:r>
-          </w:p>
-        </w:tc>
-        <w:tc>
-          <w:tcPr>
-            <w:tcW w:w="0" w:type="auto"/>
-            <w:shd w:val="clear" w:color="auto" w:fill="auto"/>
-            <w:vAlign w:val="center"/>
-          </w:tcPr>
-          <w:p>
-            <w:pPr>
-              <w:keepNext w:val="0"/>
-              <w:keepLines w:val="0"/>
-              <w:widowControl/>
-              <w:suppressLineNumbers w:val="0"/>
-              <w:jc w:val="left"/>
-            </w:pPr>
-            <w:r>
-              <w:rPr>
-                <w:rFonts w:ascii="宋体" w:hAnsi="宋体" w:eastAsia="宋体" w:cs="宋体"/>
-                <w:kern w:val="0"/>
-                <w:sz w:val="24"/>
-                <w:szCs w:val="24"/>
-                <w:lang w:val="en-US" w:eastAsia="zh-CN" w:bidi="ar"/>
-              </w:rPr>
-              <w:t>每多一个 SPI 设备就新增一个 GPIO CS</w:t>
+              <w:t>LCD 使用 PB12，ICM-20948 使用 PE5</w:t>
+            </w:r>
+          </w:p>
+        </w:tc>
+        <w:tc>
+          <w:tcPr>
+            <w:tcW w:w="0" w:type="auto"/>
+            <w:shd w:val="clear" w:color="auto" w:fill="auto"/>
+            <w:vAlign w:val="center"/>
+          </w:tcPr>
+          <w:p>
+            <w:pPr>
+              <w:keepNext w:val="0"/>
+              <w:keepLines w:val="0"/>
+              <w:widowControl/>
+              <w:suppressLineNumbers w:val="0"/>
+              <w:jc w:val="left"/>
+            </w:pPr>
+            <w:r>
+              <w:rPr>
+                <w:rFonts w:ascii="宋体" w:hAnsi="宋体" w:eastAsia="宋体" w:cs="宋体"/>
+                <w:kern w:val="0"/>
+                <w:sz w:val="24"/>
+                <w:szCs w:val="24"/>
+                <w:lang w:val="en-US" w:eastAsia="zh-CN" w:bidi="ar"/>
+              </w:rPr>
+              <w:t>新增 SPI 设备时必须分配独立 CS，并核对总线模式和时序</w:t>
             </w:r>
           </w:p>
         </w:tc>
@@ -17127,33 +17122,33 @@
                 <w:szCs w:val="24"/>
                 <w:lang w:val="en-US" w:eastAsia="zh-CN" w:bidi="ar"/>
               </w:rPr>
-              <w:t>目前未单独写驱动</w:t>
-            </w:r>
-          </w:p>
-        </w:tc>
-        <w:tc>
-          <w:tcPr>
-            <w:tcW w:w="0" w:type="auto"/>
-            <w:shd w:val="clear" w:color="auto" w:fill="auto"/>
-            <w:vAlign w:val="center"/>
-          </w:tcPr>
-          <w:p>
-            <w:pPr>
-              <w:keepNext w:val="0"/>
-              <w:keepLines w:val="0"/>
-              <w:widowControl/>
-              <w:suppressLineNumbers w:val="0"/>
-              <w:jc w:val="left"/>
-            </w:pPr>
-            <w:r>
-              <w:rPr>
-                <w:rFonts w:ascii="宋体" w:hAnsi="宋体" w:eastAsia="宋体" w:cs="宋体"/>
-                <w:kern w:val="0"/>
-                <w:sz w:val="24"/>
-                <w:szCs w:val="24"/>
-                <w:lang w:val="en-US" w:eastAsia="zh-CN" w:bidi="ar"/>
-              </w:rPr>
-              <w:t>如果用 I2C，优先接 PB8/PB9；如果用 SPI，优先共用 SPI2，再加独立 CS</w:t>
+              <w:t>已实现：SPI2，CS=PE5</w:t>
+            </w:r>
+          </w:p>
+        </w:tc>
+        <w:tc>
+          <w:tcPr>
+            <w:tcW w:w="0" w:type="auto"/>
+            <w:shd w:val="clear" w:color="auto" w:fill="auto"/>
+            <w:vAlign w:val="center"/>
+          </w:tcPr>
+          <w:p>
+            <w:pPr>
+              <w:keepNext w:val="0"/>
+              <w:keepLines w:val="0"/>
+              <w:widowControl/>
+              <w:suppressLineNumbers w:val="0"/>
+              <w:jc w:val="left"/>
+            </w:pPr>
+            <w:r>
+              <w:rPr>
+                <w:rFonts w:ascii="宋体" w:hAnsi="宋体" w:eastAsia="宋体" w:cs="宋体"/>
+                <w:kern w:val="0"/>
+                <w:sz w:val="24"/>
+                <w:szCs w:val="24"/>
+                <w:lang w:val="en-US" w:eastAsia="zh-CN" w:bidi="ar"/>
+              </w:rPr>
+              <w:t>当前驱动使用 SPI2；4WD 下与 LCD 共线需联合验证</w:t>
             </w:r>
           </w:p>
         </w:tc>
@@ -17252,33 +17247,33 @@
                 <w:szCs w:val="24"/>
                 <w:lang w:val="en-US" w:eastAsia="zh-CN" w:bidi="ar"/>
               </w:rPr>
-              <w:t>目前未单独写驱动</w:t>
-            </w:r>
-          </w:p>
-        </w:tc>
-        <w:tc>
-          <w:tcPr>
-            <w:tcW w:w="0" w:type="auto"/>
-            <w:shd w:val="clear" w:color="auto" w:fill="auto"/>
-            <w:vAlign w:val="center"/>
-          </w:tcPr>
-          <w:p>
-            <w:pPr>
-              <w:keepNext w:val="0"/>
-              <w:keepLines w:val="0"/>
-              <w:widowControl/>
-              <w:suppressLineNumbers w:val="0"/>
-              <w:jc w:val="left"/>
-            </w:pPr>
-            <w:r>
-              <w:rPr>
-                <w:rFonts w:ascii="宋体" w:hAnsi="宋体" w:eastAsia="宋体" w:cs="宋体"/>
-                <w:kern w:val="0"/>
-                <w:sz w:val="24"/>
-                <w:szCs w:val="24"/>
-                <w:lang w:val="en-US" w:eastAsia="zh-CN" w:bidi="ar"/>
-              </w:rPr>
-              <w:t>优先接 PB8/PB9</w:t>
+              <w:t>已实现：I2C1，7 位地址 0x29；XSHUT 默认未启用</w:t>
+            </w:r>
+          </w:p>
+        </w:tc>
+        <w:tc>
+          <w:tcPr>
+            <w:tcW w:w="0" w:type="auto"/>
+            <w:shd w:val="clear" w:color="auto" w:fill="auto"/>
+            <w:vAlign w:val="center"/>
+          </w:tcPr>
+          <w:p>
+            <w:pPr>
+              <w:keepNext w:val="0"/>
+              <w:keepLines w:val="0"/>
+              <w:widowControl/>
+              <w:suppressLineNumbers w:val="0"/>
+              <w:jc w:val="left"/>
+            </w:pPr>
+            <w:r>
+              <w:rPr>
+                <w:rFonts w:ascii="宋体" w:hAnsi="宋体" w:eastAsia="宋体" w:cs="宋体"/>
+                <w:kern w:val="0"/>
+                <w:sz w:val="24"/>
+                <w:szCs w:val="24"/>
+                <w:lang w:val="en-US" w:eastAsia="zh-CN" w:bidi="ar"/>
+              </w:rPr>
+              <w:t>与 MCU 灰度和 OLED 共用 I2C1；注意地址和总线负载</w:t>
             </w:r>
           </w:p>
         </w:tc>
@@ -17378,33 +17373,33 @@
                 <w:szCs w:val="24"/>
                 <w:lang w:val="en-US" w:eastAsia="zh-CN" w:bidi="ar"/>
               </w:rPr>
-              <w:t>USART2 已启用 PD5/PD6</w:t>
-            </w:r>
-          </w:p>
-        </w:tc>
-        <w:tc>
-          <w:tcPr>
-            <w:tcW w:w="0" w:type="auto"/>
-            <w:shd w:val="clear" w:color="auto" w:fill="auto"/>
-            <w:vAlign w:val="center"/>
-          </w:tcPr>
-          <w:p>
-            <w:pPr>
-              <w:keepNext w:val="0"/>
-              <w:keepLines w:val="0"/>
-              <w:widowControl/>
-              <w:suppressLineNumbers w:val="0"/>
-              <w:jc w:val="left"/>
-            </w:pPr>
-            <w:r>
-              <w:rPr>
-                <w:rFonts w:ascii="宋体" w:hAnsi="宋体" w:eastAsia="宋体" w:cs="宋体"/>
-                <w:kern w:val="0"/>
-                <w:sz w:val="24"/>
-                <w:szCs w:val="24"/>
-                <w:lang w:val="en-US" w:eastAsia="zh-CN" w:bidi="ar"/>
-              </w:rPr>
-              <w:t>可直接用 USART2</w:t>
+              <w:t>未实现；USART2 已用于 K210 通信模块</w:t>
+            </w:r>
+          </w:p>
+        </w:tc>
+        <w:tc>
+          <w:tcPr>
+            <w:tcW w:w="0" w:type="auto"/>
+            <w:shd w:val="clear" w:color="auto" w:fill="auto"/>
+            <w:vAlign w:val="center"/>
+          </w:tcPr>
+          <w:p>
+            <w:pPr>
+              <w:keepNext w:val="0"/>
+              <w:keepLines w:val="0"/>
+              <w:widowControl/>
+              <w:suppressLineNumbers w:val="0"/>
+              <w:jc w:val="left"/>
+            </w:pPr>
+            <w:r>
+              <w:rPr>
+                <w:rFonts w:ascii="宋体" w:hAnsi="宋体" w:eastAsia="宋体" w:cs="宋体"/>
+                <w:kern w:val="0"/>
+                <w:sz w:val="24"/>
+                <w:szCs w:val="24"/>
+                <w:lang w:val="en-US" w:eastAsia="zh-CN" w:bidi="ar"/>
+              </w:rPr>
+              <w:t>若接入 E220，必须另选串口或与 K210 二选一，并重新核对板级引脚</w:t>
             </w:r>
           </w:p>
         </w:tc>
@@ -17504,33 +17499,33 @@
                 <w:szCs w:val="24"/>
                 <w:lang w:val="en-US" w:eastAsia="zh-CN" w:bidi="ar"/>
               </w:rPr>
-              <w:t>USART2 已启用 PD5/PD6</w:t>
-            </w:r>
-          </w:p>
-        </w:tc>
-        <w:tc>
-          <w:tcPr>
-            <w:tcW w:w="0" w:type="auto"/>
-            <w:shd w:val="clear" w:color="auto" w:fill="auto"/>
-            <w:vAlign w:val="center"/>
-          </w:tcPr>
-          <w:p>
-            <w:pPr>
-              <w:keepNext w:val="0"/>
-              <w:keepLines w:val="0"/>
-              <w:widowControl/>
-              <w:suppressLineNumbers w:val="0"/>
-              <w:jc w:val="left"/>
-            </w:pPr>
-            <w:r>
-              <w:rPr>
-                <w:rFonts w:ascii="宋体" w:hAnsi="宋体" w:eastAsia="宋体" w:cs="宋体"/>
-                <w:kern w:val="0"/>
-                <w:sz w:val="24"/>
-                <w:szCs w:val="24"/>
-                <w:lang w:val="en-US" w:eastAsia="zh-CN" w:bidi="ar"/>
-              </w:rPr>
-              <w:t>如果 USART2 给无线，则需要另规划串口</w:t>
+              <w:t>通信模块已实现但默认任务表未注册；协议仍需统一</w:t>
+            </w:r>
+          </w:p>
+        </w:tc>
+        <w:tc>
+          <w:tcPr>
+            <w:tcW w:w="0" w:type="auto"/>
+            <w:shd w:val="clear" w:color="auto" w:fill="auto"/>
+            <w:vAlign w:val="center"/>
+          </w:tcPr>
+          <w:p>
+            <w:pPr>
+              <w:keepNext w:val="0"/>
+              <w:keepLines w:val="0"/>
+              <w:widowControl/>
+              <w:suppressLineNumbers w:val="0"/>
+              <w:jc w:val="left"/>
+            </w:pPr>
+            <w:r>
+              <w:rPr>
+                <w:rFonts w:ascii="宋体" w:hAnsi="宋体" w:eastAsia="宋体" w:cs="宋体"/>
+                <w:kern w:val="0"/>
+                <w:sz w:val="24"/>
+                <w:szCs w:val="24"/>
+                <w:lang w:val="en-US" w:eastAsia="zh-CN" w:bidi="ar"/>
+              </w:rPr>
+              <w:t>当前 USART2 为 PA2/PA3；K210/main.py 与 STM32 帧格式不一致</w:t>
             </w:r>
           </w:p>
         </w:tc>
@@ -17567,11 +17562,9 @@
           <w:rFonts w:hint="eastAsia"/>
           <w:lang w:val="en-US" w:eastAsia="zh-CN"/>
         </w:rPr>
-        <w:t>LCD</w:t>
+        <w:t>四、LCD 硬件 SPI 接线（当前代码未分配独立 RES/RST 引脚）</w:t>
       </w:r>
-      <w:r>
-        <w:t>硬件接线</w:t>
-      </w:r>
+      <w:r/>
     </w:p>
     <w:tbl>
       <w:tblPr>
@@ -17914,7 +17907,7 @@
                 <w:szCs w:val="24"/>
                 <w:lang w:val="en-US" w:eastAsia="zh-CN" w:bidi="ar"/>
               </w:rPr>
-              <w:t>建议使用3.3V</w:t>
+              <w:t>按 LCD 模块规格确认；项目资料建议 3.3V</w:t>
             </w:r>
           </w:p>
         </w:tc>
@@ -17992,7 +17985,7 @@
                 <w:szCs w:val="24"/>
                 <w:lang w:val="en-US" w:eastAsia="zh-CN" w:bidi="ar"/>
               </w:rPr>
-              <w:t>PA5</w:t>
+              <w:t>2WD：PA5（SPI1）；4WD：PB13（SPI2）</w:t>
             </w:r>
             <w:r>
               <w:rPr>
@@ -18002,7 +17995,6 @@
                 <w:szCs w:val="24"/>
                 <w:lang w:val="en-US" w:eastAsia="zh-CN" w:bidi="ar"/>
               </w:rPr>
-              <w:t xml:space="preserve">    PB13</w:t>
             </w:r>
           </w:p>
         </w:tc>
@@ -18120,7 +18112,7 @@
                 <w:szCs w:val="24"/>
                 <w:lang w:val="en-US" w:eastAsia="zh-CN" w:bidi="ar"/>
               </w:rPr>
-              <w:t>PA7</w:t>
+              <w:t>2WD：PA7（SPI1）；4WD：PB15（SPI2）</w:t>
             </w:r>
             <w:r>
               <w:rPr>
@@ -18130,15 +18122,13 @@
                 <w:szCs w:val="24"/>
                 <w:lang w:val="en-US" w:eastAsia="zh-CN" w:bidi="ar"/>
               </w:rPr>
-              <w:t xml:space="preserve">    </w:t>
-            </w:r>
-            <w:r>
-              <w:rPr>
-                <w:rFonts w:ascii="宋体" w:hAnsi="宋体" w:eastAsia="宋体" w:cs="宋体"/>
-                <w:sz w:val="24"/>
-                <w:szCs w:val="24"/>
-              </w:rPr>
-              <w:t xml:space="preserve">PB15 </w:t>
+            </w:r>
+            <w:r>
+              <w:rPr>
+                <w:rFonts w:ascii="宋体" w:hAnsi="宋体" w:eastAsia="宋体" w:cs="宋体"/>
+                <w:sz w:val="24"/>
+                <w:szCs w:val="24"/>
+              </w:rPr>
             </w:r>
           </w:p>
         </w:tc>
@@ -18252,7 +18242,7 @@
                 <w:szCs w:val="24"/>
                 <w:lang w:val="en-US" w:eastAsia="zh-CN" w:bidi="ar"/>
               </w:rPr>
-              <w:t>PA6</w:t>
+              <w:t>2WD：PA6（SPI1）；4WD：PB14（SPI2）</w:t>
             </w:r>
           </w:p>
         </w:tc>
@@ -18352,7 +18342,7 @@
                 <w:szCs w:val="24"/>
                 <w:lang w:val="en-US" w:eastAsia="zh-CN" w:bidi="ar"/>
               </w:rPr>
-              <w:t>PB12</w:t>
+              <w:t>PB12（BSP_GPIO_LCD_CS）</w:t>
             </w:r>
           </w:p>
         </w:tc>
@@ -18452,7 +18442,7 @@
                 <w:szCs w:val="24"/>
                 <w:lang w:val="en-US" w:eastAsia="zh-CN" w:bidi="ar"/>
               </w:rPr>
-              <w:t>PC10</w:t>
+              <w:t>PC10（BSP_GPIO_LCD_DC）</w:t>
             </w:r>
           </w:p>
         </w:tc>
@@ -18552,7 +18542,7 @@
                 <w:szCs w:val="24"/>
                 <w:lang w:val="en-US" w:eastAsia="zh-CN" w:bidi="ar"/>
               </w:rPr>
-              <w:t>PC11</w:t>
+              <w:t>PC11（BSP_GPIO_LCD_BL）</w:t>
             </w:r>
           </w:p>
         </w:tc>
@@ -19412,7 +19402,7 @@
           <w:sz w:val="24"/>
           <w:szCs w:val="24"/>
         </w:rPr>
-        <w:t>| K210 TX/RX | PA3/PA2 | USART2    |</w:t>
+        <w:t>K210：STM32 使用 USART2（PA2 TX、PA3 RX，115200 8N1）；K210 侧 IO8 为 TX、IO6 为 RX，双方需共地。当前 K210/main.py 与 STM32 的数据帧格式不一致，联调前必须统一协议。</w:t>
       </w:r>
     </w:p>
     <w:sectPr>

</xml_diff>